<commit_message>
Reduce heading scale to 14/12/11 and require blue hyperlinked citations
- Title 14, Heading 1 12, Heading 2 11 (body stays 12); updated spec tables,
  skeleton annotations, and rebuilt house-style.docx accordingly.
- Citations must be live blue hyperlinks (Hyperlink style, 0563C1, underlined);
  the template's sample endnote now contains a real working blue hyperlink with
  its part-scoped relationship, never a plain-text URL.
</commit_message>
<xml_diff>
--- a/skills/ai-legal-news/references/house-style.docx
+++ b/skills/ai-legal-news/references/house-style.docx
@@ -163,7 +163,7 @@
         <w:endnoteRef/>
       </w:r>
       <w:r>
-        <w:t xml:space="preserve"> Sample endnote. Bluebook style: </w:t>
+        <w:t xml:space="preserve"> Sample endnote, Bluebook style: </w:t>
       </w:r>
       <w:r>
         <w:rPr>
@@ -172,7 +172,18 @@
         <w:t xml:space="preserve">Case Name v. Other</w:t>
       </w:r>
       <w:r>
-        <w:t xml:space="preserve">, No. 00-000 (Ct. 2026), with a live hyperlink to the primary source.</w:t>
+        <w:t xml:space="preserve">, No. 00-000 (Ct. 2026), </w:t>
+      </w:r>
+      <w:hyperlink r:id="rId1" w:history="1">
+        <w:r>
+          <w:rPr>
+            <w:rStyle w:val="Hyperlink"/>
+          </w:rPr>
+          <w:t xml:space="preserve">primary-source URL</w:t>
+        </w:r>
+      </w:hyperlink>
+      <w:r>
+        <w:t xml:space="preserve"> (blue, underlined, clickable).</w:t>
       </w:r>
     </w:p>
   </w:endnote>
@@ -232,8 +243,8 @@
     </w:pPr>
     <w:rPr>
       <w:b/>
-      <w:sz w:val="32"/>
-      <w:szCs w:val="32"/>
+      <w:sz w:val="28"/>
+      <w:szCs w:val="28"/>
     </w:rPr>
   </w:style>
   <w:style w:type="paragraph" w:styleId="Subtitle">
@@ -278,8 +289,8 @@
     </w:pPr>
     <w:rPr>
       <w:b/>
-      <w:sz w:val="28"/>
-      <w:szCs w:val="28"/>
+      <w:sz w:val="24"/>
+      <w:szCs w:val="24"/>
     </w:rPr>
   </w:style>
   <w:style w:type="paragraph" w:styleId="Heading2">
@@ -294,8 +305,8 @@
     </w:pPr>
     <w:rPr>
       <w:b/>
-      <w:sz w:val="24"/>
-      <w:szCs w:val="24"/>
+      <w:sz w:val="22"/>
+      <w:szCs w:val="22"/>
     </w:rPr>
   </w:style>
   <w:style w:type="paragraph" w:styleId="ListBullet">

</xml_diff>